<commit_message>
Fix gerador de temporarios, identidade do grupo QUADCORE, README e relatorios E-folio B
- tac_generator: corrige recursao infinita em _new_temp
- corrige grupo DUALCORE->QUADCORE e autores em todo o codigo e testes
- reescreve README.txt para o E-folio B
- corrige grupo/membros nos 2 relatorios .docx; remove mencao a symbol_table.py
- run_tests: corrige encoding no Windows e alarga bateria de testes
- adiciona testes de cobertura (spec_fatorial, spec_media, teste_cobertura)
- limpezas: numeracao de comentarios, .gitignore em UTF-8, stdout robusto
</commit_message>
<xml_diff>
--- a/realatorio efolioB_quadcore.docx
+++ b/realatorio efolioB_quadcore.docx
@@ -134,7 +134,7 @@
           <w:b/>
           <w:bCs/>
         </w:rPr>
-        <w:t>Grupo: DUALCORE</w:t>
+        <w:t>Grupo: QUADCORE</w:t>
       </w:r>
     </w:p>
     <w:p>
@@ -164,6 +164,36 @@
           <w:bCs/>
         </w:rPr>
         <w:t>Maria Costa (2304361)</w:t>
+      </w:r>
+    </w:p>
+    <w:p>
+      <w:pPr>
+        <w:rPr>
+          <w:b/>
+          <w:bCs/>
+        </w:rPr>
+      </w:pPr>
+      <w:r>
+        <w:rPr>
+          <w:b/>
+          <w:bCs/>
+        </w:rPr>
+        <w:t>Nuno Rolo ([Nº A PREENCHER])</w:t>
+      </w:r>
+    </w:p>
+    <w:p>
+      <w:pPr>
+        <w:rPr>
+          <w:b/>
+          <w:bCs/>
+        </w:rPr>
+      </w:pPr>
+      <w:r>
+        <w:rPr>
+          <w:b/>
+          <w:bCs/>
+        </w:rPr>
+        <w:t>Fábio Oliveira ([Nº A PREENCHER])</w:t>
       </w:r>
     </w:p>
     <w:p>
@@ -1729,15 +1759,6 @@
           <w:rStyle w:val="VerbatimChar"/>
         </w:rPr>
         <w:t>semantic.py</w:t>
-      </w:r>
-      <w:r>
-        <w:br/>
-      </w:r>
-      <w:r>
-        <w:rPr>
-          <w:rStyle w:val="VerbatimChar"/>
-        </w:rPr>
-        <w:t>symbol_table.py</w:t>
       </w:r>
       <w:r>
         <w:br/>

</xml_diff>